<commit_message>
[Doc] Updates for 3.0.1.0
</commit_message>
<xml_diff>
--- a/docs/whatsnew.docx
+++ b/docs/whatsnew.docx
@@ -287,7 +287,13 @@
         </w:numPr>
       </w:pPr>
       <w:r>
-        <w:t>We have added a new __XSHARP3__ define which is always true, so you can conditional compile differences between XSharp 3 and a previous version</w:t>
+        <w:t xml:space="preserve">We have added a new __XSHARP3__ define which is always true, so you can </w:t>
+      </w:r>
+      <w:r>
+        <w:t>conditionally</w:t>
+      </w:r>
+      <w:r>
+        <w:t xml:space="preserve"> compile differences between XSharp 3 and a previous version</w:t>
       </w:r>
     </w:p>
     <w:p>
@@ -487,6 +493,17 @@
     </w:p>
     <w:p>
       <w:pPr>
+        <w:numPr>
+          <w:ilvl w:val="0"/>
+          <w:numId w:val="27"/>
+        </w:numPr>
+      </w:pPr>
+      <w:r>
+        <w:t>Ensure INIT methods are called inside subclasses (#1988)</w:t>
+      </w:r>
+    </w:p>
+    <w:p>
+      <w:pPr>
         <w:pStyle w:val="Heading1"/>
       </w:pPr>
       <w:r>
@@ -548,7 +565,13 @@
         </w:numPr>
       </w:pPr>
       <w:r>
-        <w:t>The builds system no longer automarically picks up the include folder from your Vulcan installation</w:t>
+        <w:t>The builds system no longer automa</w:t>
+      </w:r>
+      <w:r>
+        <w:t>t</w:t>
+      </w:r>
+      <w:r>
+        <w:t>ically picks up the include folder from your Vulcan installation</w:t>
       </w:r>
     </w:p>
     <w:p>
@@ -650,7 +673,11 @@
         </w:numPr>
       </w:pPr>
       <w:r>
-        <w:t>Fixed an issue during build where an empty &lt;PrebuildEvent&gt; that contains a CRLF could cause a build to fail.</w:t>
+        <w:t xml:space="preserve">Fixed an issue during build where an empty &lt;PrebuildEvent&gt; that contains a CRLF could cause a </w:t>
+      </w:r>
+      <w:r>
+        <w:lastRenderedPageBreak/>
+        <w:t>build to fail.</w:t>
       </w:r>
     </w:p>
     <w:p>
@@ -658,7 +685,6 @@
         <w:pStyle w:val="Heading2"/>
       </w:pPr>
       <w:r>
-        <w:lastRenderedPageBreak/>
         <w:t>Runtime</w:t>
       </w:r>
     </w:p>
@@ -990,6 +1016,7 @@
         </w:numPr>
       </w:pPr>
       <w:r>
+        <w:lastRenderedPageBreak/>
         <w:t>Fixed an error in a UDC</w:t>
       </w:r>
     </w:p>
@@ -1015,7 +1042,6 @@
         <w:rPr>
           <w:bCs/>
         </w:rPr>
-        <w:lastRenderedPageBreak/>
         <w:t>New features the FoxPro dialect.</w:t>
       </w:r>
     </w:p>
@@ -1364,6 +1390,7 @@
         </w:numPr>
       </w:pPr>
       <w:r>
+        <w:lastRenderedPageBreak/>
         <w:t>Fixed MESSAGEBOX() timeout issue and implemented dynamic parameter handling (#1897)</w:t>
       </w:r>
     </w:p>
@@ -1386,7 +1413,6 @@
         </w:numPr>
       </w:pPr>
       <w:r>
-        <w:lastRenderedPageBreak/>
         <w:t>Implemented SET DEVICE TO FILE redirection (#1901)</w:t>
       </w:r>
     </w:p>
@@ -1720,11 +1746,11 @@
         <w:t xml:space="preserve"> </w:t>
       </w:r>
       <w:r>
-        <w:t xml:space="preserve">Comment” command now takes the comment status of the first line of a block of lines to decide if the block needs to be commented or uncommented. When a line inside a block is already commented then it may end up being double commented after a comment operation. And when a block containing a double commented line is uncommented, than that line will </w:t>
+        <w:t xml:space="preserve">Comment” command now takes the comment status of the first line of a block of lines to decide if the block needs to be commented or uncommented. When a line inside a block </w:t>
       </w:r>
       <w:r>
         <w:lastRenderedPageBreak/>
-        <w:t>become single commented afterwards.</w:t>
+        <w:t>is already commented then it may end up being double commented after a comment operation. And when a block containing a double commented line is uncommented, than that line will become single commented afterwards.</w:t>
       </w:r>
     </w:p>
     <w:p>
@@ -2088,6 +2114,7 @@
         <w:pStyle w:val="Heading3"/>
       </w:pPr>
       <w:r>
+        <w:lastRenderedPageBreak/>
         <w:t>Bug Fixes</w:t>
       </w:r>
     </w:p>
@@ -2110,7 +2137,6 @@
         </w:numPr>
       </w:pPr>
       <w:r>
-        <w:lastRenderedPageBreak/>
         <w:t>Fixed an issue in the debugger where USUAL values were not shown properly formatted (#1809)</w:t>
       </w:r>
     </w:p>

</xml_diff>